<commit_message>
fix(certification): fill application form from import data and fix stpLogic conflict
Replace DOCX sample hardcodes with placeholders, expand single-candidate import fields with staging persistence, and remove duplicate stpLogic bean so the app can start.

Co-authored-by: Cursor <cursoragent@cursor.com>
</commit_message>
<xml_diff>
--- a/services/platform-api/src/main/resources/templates/职业技能等级认定申请表.docx
+++ b/services/platform-api/src/main/resources/templates/职业技能等级认定申请表.docx
@@ -808,14 +808,14 @@
               <w:rPr>
                 <w:rFonts w:asciiTheme="majorEastAsia" w:hAnsiTheme="majorEastAsia" w:eastAsiaTheme="majorEastAsia"/>
               </w:rPr>
-              <w:t>广西壮族自治区百色市右江区六塘</w:t>
+              <w:t>{{company_address}}</w:t>
             </w:r>
             <w:r>
               <w:rPr>
                 <w:rFonts w:hint="eastAsia" w:asciiTheme="majorEastAsia" w:hAnsiTheme="majorEastAsia" w:eastAsiaTheme="majorEastAsia"/>
                 <w:lang w:val="en-US" w:eastAsia="zh-CN"/>
               </w:rPr>
-              <w:t>工业园</w:t>
+              <w:t/>
             </w:r>
           </w:p>
         </w:tc>
@@ -1031,14 +1031,14 @@
                 <w:rFonts w:hint="eastAsia" w:ascii="宋体" w:hAnsi="宋体" w:eastAsia="宋体" w:cs="宋体"/>
                 <w:lang w:val="en-US" w:eastAsia="zh-CN"/>
               </w:rPr>
-              <w:t>铝</w:t>
+              <w:t>{{original_work_type}}</w:t>
             </w:r>
             <w:r>
               <w:rPr>
                 <w:rFonts w:hint="eastAsia" w:ascii="宋体" w:hAnsi="宋体" w:eastAsia="宋体" w:cs="宋体"/>
                 <w:lang w:eastAsia="zh-CN"/>
               </w:rPr>
-              <w:t>电解槽操作工</w:t>
+              <w:t/>
             </w:r>
           </w:p>
         </w:tc>
@@ -1086,7 +1086,7 @@
                 <w:sz w:val="24"/>
                 <w:szCs w:val="24"/>
               </w:rPr>
-              <w:t>原技术等级</w:t>
+              <w:t>原技术等级{{original_level}}</w:t>
             </w:r>
           </w:p>
         </w:tc>
@@ -1131,7 +1131,7 @@
                 <w:sz w:val="24"/>
                 <w:szCs w:val="24"/>
               </w:rPr>
-              <w:t>原证书编号</w:t>
+              <w:t>原证书编号{{original_cert_no}}</w:t>
             </w:r>
           </w:p>
         </w:tc>
@@ -1226,7 +1226,7 @@
                 <w:szCs w:val="22"/>
                 <w:lang w:val="en-US" w:eastAsia="zh-CN"/>
               </w:rPr>
-              <w:t>铝</w:t>
+              <w:t>{{apply_work_type}}</w:t>
             </w:r>
             <w:r>
               <w:rPr>
@@ -1234,7 +1234,7 @@
                 <w:sz w:val="22"/>
                 <w:szCs w:val="22"/>
               </w:rPr>
-              <w:t>电解槽操作工</w:t>
+              <w:t/>
             </w:r>
           </w:p>
         </w:tc>
@@ -1344,7 +1344,7 @@
                 <w:szCs w:val="22"/>
                 <w:lang w:val="en-US" w:eastAsia="zh-CN"/>
               </w:rPr>
-              <w:t>一</w:t>
+              <w:t>{{apply_level}}</w:t>
             </w:r>
             <w:r>
               <w:rPr>
@@ -1353,7 +1353,7 @@
                 <w:szCs w:val="22"/>
                 <w:lang w:eastAsia="zh-CN"/>
               </w:rPr>
-              <w:t>级/高级</w:t>
+              <w:t/>
             </w:r>
             <w:r>
               <w:rPr>
@@ -1362,7 +1362,7 @@
                 <w:szCs w:val="22"/>
                 <w:lang w:val="en-US" w:eastAsia="zh-CN"/>
               </w:rPr>
-              <w:t>技师</w:t>
+              <w:t/>
             </w:r>
           </w:p>
         </w:tc>
@@ -1444,20 +1444,20 @@
                 <w:rFonts w:hint="eastAsia" w:asciiTheme="majorEastAsia" w:hAnsiTheme="majorEastAsia" w:eastAsiaTheme="majorEastAsia"/>
                 <w:lang w:val="en-US" w:eastAsia="zh-CN"/>
               </w:rPr>
-              <w:t>2024年4月-至今，在</w:t>
+              <w:t>{{work_resume}}</w:t>
             </w:r>
             <w:r>
               <w:rPr>
                 <w:rFonts w:asciiTheme="majorEastAsia" w:hAnsiTheme="majorEastAsia" w:eastAsiaTheme="majorEastAsia"/>
               </w:rPr>
-              <w:t>{{company_name}}</w:t>
+              <w:t/>
             </w:r>
             <w:r>
               <w:rPr>
                 <w:rFonts w:hint="eastAsia" w:asciiTheme="majorEastAsia" w:hAnsiTheme="majorEastAsia" w:eastAsiaTheme="majorEastAsia"/>
                 <w:lang w:val="en-US" w:eastAsia="zh-CN"/>
               </w:rPr>
-              <w:t>工作</w:t>
+              <w:t/>
             </w:r>
           </w:p>
         </w:tc>
@@ -2121,7 +2121,7 @@
                 <w:u w:val="single"/>
                 <w:lang w:val="en-US" w:eastAsia="zh-CN"/>
               </w:rPr>
-              <w:t>铝</w:t>
+              <w:t>{{training_summary}}</w:t>
             </w:r>
             <w:r>
               <w:rPr>
@@ -2133,7 +2133,7 @@
                 <w:u w:val="single"/>
                 <w:lang w:eastAsia="zh-CN"/>
               </w:rPr>
-              <w:t>电解槽操作工</w:t>
+              <w:t/>
             </w:r>
             <w:r>
               <w:rPr>
@@ -2146,7 +2146,7 @@
                 <w:u w:val="single"/>
                 <w:lang w:eastAsia="zh-CN"/>
               </w:rPr>
-              <w:t xml:space="preserve"> </w:t>
+              <w:t xml:space="preserve"/>
             </w:r>
             <w:r>
               <w:rPr>
@@ -2158,7 +2158,7 @@
                 <w:szCs w:val="24"/>
                 <w:lang w:eastAsia="zh-CN"/>
               </w:rPr>
-              <w:t>培训</w:t>
+              <w:t/>
             </w:r>
             <w:r>
               <w:rPr>
@@ -2170,7 +2170,7 @@
                 <w:szCs w:val="24"/>
                 <w:lang w:eastAsia="zh-CN"/>
               </w:rPr>
-              <w:t>已达标准学</w:t>
+              <w:t/>
             </w:r>
             <w:r>
               <w:rPr>
@@ -2182,7 +2182,7 @@
                 <w:szCs w:val="24"/>
                 <w:lang w:eastAsia="zh-CN"/>
               </w:rPr>
-              <w:t>时</w:t>
+              <w:t/>
             </w:r>
             <w:r>
               <w:rPr>
@@ -2195,7 +2195,7 @@
                 <w:szCs w:val="24"/>
                 <w:lang w:eastAsia="zh-CN"/>
               </w:rPr>
-              <w:t>，（</w:t>
+              <w:t/>
             </w:r>
             <w:r>
               <w:rPr>
@@ -2207,7 +2207,7 @@
                 <w:szCs w:val="24"/>
                 <w:lang w:eastAsia="zh-CN"/>
               </w:rPr>
-              <w:t>是</w:t>
+              <w:t/>
             </w:r>
             <w:r>
               <w:rPr>
@@ -2219,7 +2219,7 @@
                 <w:szCs w:val="24"/>
                 <w:lang w:eastAsia="zh-CN"/>
               </w:rPr>
-              <w:t>/</w:t>
+              <w:t/>
             </w:r>
             <w:r>
               <w:rPr>
@@ -2231,7 +2231,7 @@
                 <w:szCs w:val="24"/>
                 <w:lang w:eastAsia="zh-CN"/>
               </w:rPr>
-              <w:t>否）为所在地区人社部门（认定</w:t>
+              <w:t/>
             </w:r>
             <w:r>
               <w:rPr>
@@ -2243,7 +2243,7 @@
                 <w:szCs w:val="24"/>
                 <w:lang w:eastAsia="zh-CN"/>
               </w:rPr>
-              <w:t>/</w:t>
+              <w:t/>
             </w:r>
             <w:r>
               <w:rPr>
@@ -2255,7 +2255,7 @@
                 <w:szCs w:val="24"/>
                 <w:lang w:eastAsia="zh-CN"/>
               </w:rPr>
-              <w:t>备</w:t>
+              <w:t/>
             </w:r>
             <w:r>
               <w:rPr>
@@ -2267,7 +2267,7 @@
                 <w:szCs w:val="24"/>
                 <w:lang w:eastAsia="zh-CN"/>
               </w:rPr>
-              <w:t>案）的企业在岗人员技能提升培</w:t>
+              <w:t/>
             </w:r>
             <w:r>
               <w:rPr>
@@ -2279,7 +2279,7 @@
                 <w:szCs w:val="24"/>
                 <w:lang w:eastAsia="zh-CN"/>
               </w:rPr>
-              <w:t>训。</w:t>
+              <w:t/>
             </w:r>
           </w:p>
           <w:p>
@@ -2301,7 +2301,7 @@
                 <w:sz w:val="24"/>
                 <w:szCs w:val="24"/>
               </w:rPr>
-              <w:t>特此证明。</w:t>
+              <w:t/>
             </w:r>
           </w:p>
         </w:tc>
@@ -3146,20 +3146,20 @@
                 <w:rFonts w:hint="eastAsia" w:ascii="宋体" w:hAnsi="宋体" w:eastAsia="宋体" w:cs="宋体"/>
                 <w:lang w:val="en-US" w:eastAsia="zh-CN"/>
               </w:rPr>
-              <w:t>一</w:t>
+              <w:t>{{cert_level}}</w:t>
             </w:r>
             <w:r>
               <w:rPr>
                 <w:rFonts w:hint="eastAsia" w:ascii="宋体" w:hAnsi="宋体" w:eastAsia="宋体" w:cs="宋体"/>
               </w:rPr>
-              <w:t>级/高级</w:t>
+              <w:t/>
             </w:r>
             <w:r>
               <w:rPr>
                 <w:rFonts w:hint="eastAsia" w:ascii="宋体" w:hAnsi="宋体" w:eastAsia="宋体" w:cs="宋体"/>
                 <w:lang w:val="en-US" w:eastAsia="zh-CN"/>
               </w:rPr>
-              <w:t>技师</w:t>
+              <w:t/>
             </w:r>
           </w:p>
         </w:tc>
@@ -3359,7 +3359,7 @@
                 <w:rFonts w:hint="eastAsia" w:ascii="宋体" w:hAnsi="宋体" w:eastAsia="宋体" w:cs="宋体"/>
                 <w:lang w:val="en-US" w:eastAsia="zh-CN"/>
               </w:rPr>
-              <w:t>{{apply_work_type}}</w:t>
+              <w:t>{{work_direction}}</w:t>
             </w:r>
           </w:p>
         </w:tc>
@@ -3459,7 +3459,7 @@
                 <w:szCs w:val="24"/>
                 <w:lang w:eastAsia="zh-CN"/>
               </w:rPr>
-              <w:t>经审查，该同志符合</w:t>
+              <w:t>{{cert_conclusion}}</w:t>
             </w:r>
             <w:r>
               <w:rPr>
@@ -3472,7 +3472,7 @@
                 <w:u w:val="single"/>
                 <w:lang w:eastAsia="zh-CN"/>
               </w:rPr>
-              <w:t xml:space="preserve">  </w:t>
+              <w:t xml:space="preserve"/>
             </w:r>
             <w:r>
               <w:rPr>
@@ -3485,7 +3485,7 @@
                 <w:u w:val="single"/>
                 <w:lang w:eastAsia="zh-CN"/>
               </w:rPr>
-              <w:t xml:space="preserve"> </w:t>
+              <w:t xml:space="preserve"/>
             </w:r>
             <w:r>
               <w:rPr>
@@ -3498,7 +3498,7 @@
                 <w:u w:val="single"/>
                 <w:lang w:val="en-US" w:eastAsia="zh-CN"/>
               </w:rPr>
-              <w:t>铝</w:t>
+              <w:t/>
             </w:r>
             <w:r>
               <w:rPr>
@@ -3510,7 +3510,7 @@
                 <w:u w:val="single"/>
                 <w:lang w:eastAsia="zh-CN"/>
               </w:rPr>
-              <w:t xml:space="preserve">电解槽操作工 </w:t>
+              <w:t xml:space="preserve"/>
             </w:r>
             <w:r>
               <w:rPr>
@@ -3522,7 +3522,7 @@
                 <w:u w:val="single"/>
                 <w:lang w:val="en-US" w:eastAsia="zh-CN"/>
               </w:rPr>
-              <w:t>一</w:t>
+              <w:t/>
             </w:r>
             <w:r>
               <w:rPr>
@@ -3534,7 +3534,7 @@
                 <w:u w:val="single"/>
                 <w:lang w:eastAsia="zh-CN"/>
               </w:rPr>
-              <w:t>级/高级</w:t>
+              <w:t/>
             </w:r>
             <w:r>
               <w:rPr>
@@ -3546,7 +3546,7 @@
                 <w:u w:val="single"/>
                 <w:lang w:val="en-US" w:eastAsia="zh-CN"/>
               </w:rPr>
-              <w:t>技师</w:t>
+              <w:t/>
             </w:r>
             <w:r>
               <w:rPr>
@@ -3560,7 +3560,7 @@
                 <w:u w:val="single"/>
                 <w:lang w:eastAsia="zh-CN"/>
               </w:rPr>
-              <w:t xml:space="preserve"> </w:t>
+              <w:t xml:space="preserve"/>
             </w:r>
             <w:r>
               <w:rPr>
@@ -3573,7 +3573,7 @@
                 <w:u w:val="single"/>
                 <w:lang w:eastAsia="zh-CN"/>
               </w:rPr>
-              <w:t xml:space="preserve">   </w:t>
+              <w:t xml:space="preserve"/>
             </w:r>
             <w:r>
               <w:rPr>
@@ -3585,7 +3585,7 @@
                 <w:szCs w:val="24"/>
                 <w:lang w:eastAsia="zh-CN"/>
               </w:rPr>
-              <w:t>申报条件，且考试</w:t>
+              <w:t/>
             </w:r>
             <w:r>
               <w:rPr>
@@ -3597,7 +3597,7 @@
                 <w:szCs w:val="24"/>
                 <w:lang w:eastAsia="zh-CN"/>
               </w:rPr>
-              <w:t>合格，同意认定为</w:t>
+              <w:t/>
             </w:r>
             <w:r>
               <w:rPr>
@@ -3610,7 +3610,7 @@
                 <w:u w:val="single"/>
                 <w:lang w:eastAsia="zh-CN"/>
               </w:rPr>
-              <w:t xml:space="preserve"> </w:t>
+              <w:t xml:space="preserve"/>
             </w:r>
             <w:r>
               <w:rPr>
@@ -3623,7 +3623,7 @@
                 <w:u w:val="single"/>
                 <w:lang w:eastAsia="zh-CN"/>
               </w:rPr>
-              <w:t xml:space="preserve"> </w:t>
+              <w:t xml:space="preserve"/>
             </w:r>
             <w:r>
               <w:rPr>
@@ -3636,7 +3636,7 @@
                 <w:u w:val="single"/>
                 <w:lang w:val="en-US" w:eastAsia="zh-CN"/>
               </w:rPr>
-              <w:t>铝</w:t>
+              <w:t/>
             </w:r>
             <w:r>
               <w:rPr>
@@ -3648,7 +3648,7 @@
                 <w:u w:val="single"/>
                 <w:lang w:eastAsia="zh-CN"/>
               </w:rPr>
-              <w:t xml:space="preserve">电解槽操作工 </w:t>
+              <w:t xml:space="preserve"/>
             </w:r>
             <w:r>
               <w:rPr>
@@ -3660,7 +3660,7 @@
                 <w:u w:val="single"/>
                 <w:lang w:val="en-US" w:eastAsia="zh-CN"/>
               </w:rPr>
-              <w:t>一</w:t>
+              <w:t/>
             </w:r>
             <w:r>
               <w:rPr>
@@ -3672,7 +3672,7 @@
                 <w:u w:val="single"/>
                 <w:lang w:eastAsia="zh-CN"/>
               </w:rPr>
-              <w:t>级/高级</w:t>
+              <w:t/>
             </w:r>
             <w:r>
               <w:rPr>
@@ -3684,7 +3684,7 @@
                 <w:u w:val="single"/>
                 <w:lang w:val="en-US" w:eastAsia="zh-CN"/>
               </w:rPr>
-              <w:t>技师</w:t>
+              <w:t/>
             </w:r>
             <w:r>
               <w:rPr>
@@ -3697,7 +3697,7 @@
                 <w:u w:val="single"/>
                 <w:lang w:eastAsia="zh-CN"/>
               </w:rPr>
-              <w:t xml:space="preserve">  </w:t>
+              <w:t xml:space="preserve"/>
             </w:r>
             <w:r>
               <w:rPr>
@@ -3710,7 +3710,7 @@
                 <w:u w:val="single"/>
                 <w:lang w:eastAsia="zh-CN"/>
               </w:rPr>
-              <w:t xml:space="preserve">  </w:t>
+              <w:t xml:space="preserve"/>
             </w:r>
             <w:r>
               <w:rPr>
@@ -3722,7 +3722,7 @@
                 <w:szCs w:val="24"/>
                 <w:lang w:eastAsia="zh-CN"/>
               </w:rPr>
-              <w:t>。</w:t>
+              <w:t/>
             </w:r>
             <w:bookmarkStart w:id="0" w:name="_GoBack"/>
             <w:bookmarkEnd w:id="0"/>

</xml_diff>